<commit_message>
Ghi trả lời C3.4 (hao hụt chỉ theo dõi, không trừ) · sửa khung biểu đồ rỗng ở Tổng quan
Anh Khampla nói lại qua anh chủ dự án: hao hụt cân CHỈ THEO DÕI, không trừ tiền.
Đúng như máy đang chạy — hao_hut_pct chỉ để hiện và cảnh báo khi khoá (trên
1,5 %), cước tính theo tấn cân nơi giao là quy tắc hợp đồng, không phải phạt.
Không sửa mã; ghi câu trả lời vào kế hoạch, tệp công việc và tài liệu nghiệp vụ —
còn ba câu để trống (C1.1, C8.1, C9.1).

Kiểm lại toàn bộ trên dữ liệu gieo mới: 17 bộ + 4 bản rà. Bản rà Tổng quan bắt
được một lỗi JS thật: tháng rỗng thì module xoá cả khung canvas bằng innerHTML,
sang tháng có số liệu (hay đổi ngôn ngữ) lượt vẽ sau không tìm lại được canvas
và đổ lỗi giữa chừng. Nay đặt dòng chữ trống cạnh canvas và giấu canvas, không
xoá — khungTrong(id, trong).

Co-Authored-By: Claude Fable 5.1 <noreply@anthropic.com>
</commit_message>
<xml_diff>
--- a/DOCS/word/CONG_VIEC_CHO_ANH_KHAMPLA_CHOT.docx
+++ b/DOCS/word/CONG_VIEC_CHO_ANH_KHAMPLA_CHOT.docx
@@ -2737,7 +2737,13 @@
           <w:p>
             <w:r/>
             <w:r>
-              <w:t>Bỏ trống; đang chỉ theo dõi và cảnh báo trên 1,5 %</w:t>
+              <w:rPr>
+                <w:b/>
+              </w:rPr>
+              <w:t>Đã trả lời 22/09 (nói miệng qua anh chủ dự án): chỉ theo dõi, không trừ.</w:t>
+            </w:r>
+            <w:r>
+              <w:t xml:space="preserve"> Đúng như đang chạy — không phải sửa</w:t>
             </w:r>
           </w:p>
         </w:tc>

</xml_diff>